<commit_message>
Remove verbose enumeration pattern from all 5 briefings
Eliminates the consultant writing pattern where 2-4 sentences each present
a separate example to build toward a conclusion that could be stated directly.
Also collapses long domain breadth lists (7-8 item) to a single descriptor,
and combines paired OECD/EU AI Act citation sentences into one.

15 targeted edits across all 5 briefings. Automated audit confirms clean.

Co-Authored-By: Claude Sonnet 4.6 <noreply@anthropic.com>
</commit_message>
<xml_diff>
--- a/briefings-source/Strategic_Intelligence_Briefing_01.docx
+++ b/briefings-source/Strategic_Intelligence_Briefing_01.docx
@@ -307,7 +307,7 @@
           <w:rFonts w:ascii="Aptos" w:hAnsi="Aptos"/>
           <w:color w:val="141414"/>
         </w:rPr>
-        <w:t>Much of the current AI governance conversation still carries this weakness. The market has become fluent in inventories, use case reviews, model classifications, policy libraries, risk ratings, committee structures, and compliance preparation. Those artifacts are useful because enterprises need to know where AI is present, who owns it, which risks have been reviewed, and which standards apply. NIST's AI Risk Management Framework reflects this broader discipline through govern, map, measure, and manage functions for AI risk management. The limitation is not the framework. The limitation is what happens when the framework becomes internal process, and the enterprise still cannot prove authority at the moment AI influenced work begins moving toward action.1</w:t>
+        <w:t>Much of the current AI governance conversation still carries this weakness. The market has built detailed inventories, risk assessments, and compliance documentation. Those artifacts identify where AI operates, who owns it, and what standards apply. NIST's AI Risk Management Framework reflects this broader discipline. The limitation is not the framework. The limitation is what happens when the framework becomes internal process, and the enterprise still cannot prove authority at the moment AI influenced work begins moving toward action.1</w:t>
       </w:r>
     </w:p>
     <w:tbl>
@@ -451,15 +451,13 @@
           <w:rFonts w:ascii="Aptos" w:hAnsi="Aptos"/>
           <w:color w:val="141414"/>
         </w:rPr>
-        <w:t xml:space="preserve">Public AI governance language already points toward accountability, traceability, and oversight. The OECD AI Principles state that AI actors should be accountable based on their roles and context, and that traceability should </w:t>
+        <w:t>Public AI governance language already points in this direction. The OECD AI Principles and the EU AI Act both emphasize accountability, traceability, and oversight. The gap is still how enterprises convert those principles into enforceable authority inside live work.</w:t>
       </w:r>
       <w:r>
         <w:rPr>
           <w:rFonts w:ascii="Aptos" w:hAnsi="Aptos"/>
           <w:color w:val="141414"/>
         </w:rPr>
-        <w:lastRenderedPageBreak/>
-        <w:t xml:space="preserve">include datasets, processes, and decisions made during the AI system lifecycle. The EU AI Act also treats human oversight as a risk reduction mechanism for </w:t>
       </w:r>
       <w:proofErr w:type="gramStart"/>
       <w:r>
@@ -467,7 +465,6 @@
           <w:rFonts w:ascii="Aptos" w:hAnsi="Aptos"/>
           <w:color w:val="141414"/>
         </w:rPr>
-        <w:t>high risk</w:t>
       </w:r>
       <w:proofErr w:type="gramEnd"/>
       <w:r>
@@ -475,7 +472,7 @@
           <w:rFonts w:ascii="Aptos" w:hAnsi="Aptos"/>
           <w:color w:val="141414"/>
         </w:rPr>
-        <w:t xml:space="preserve"> AI systems. These are important signals because they show the public governance conversation moving beyond abstract ethics and toward operational proof. The gap is still how enterprises convert those principles into enforceable authority inside live work.2,3</w:t>
+        <w:t>2,3</w:t>
       </w:r>
     </w:p>
     <w:p>
@@ -552,7 +549,7 @@
           <w:rFonts w:ascii="Aptos" w:hAnsi="Aptos"/>
           <w:color w:val="141414"/>
         </w:rPr>
-        <w:t>, with what escalation obligation, and with what evidence record. The same logic applies to underwriting, hiring, legal review, transaction monitoring, customer remediation, healthcare operations, financial controls, and any workflow where AI materially shapes a consequential outcome.</w:t>
+        <w:t>, with what escalation obligation, and with what evidence record. The same logic applies across any workflow where AI materially shapes a consequential outcome.</w:t>
       </w:r>
     </w:p>
     <w:p>

</xml_diff>